<commit_message>
Fix: Excel floating-point, CapEx front-loading, scenarios, Word §34c/Satzung/Downside/Kapazität/Gründungszuschuss improvements, PDFs regeneriert
</commit_message>
<xml_diff>
--- a/AMAVIO_Businessplan_Kernfassung_27Seiten_v1_7_AMAVIO_Living.docx
+++ b/AMAVIO_Businessplan_Kernfassung_27Seiten_v1_7_AMAVIO_Living.docx
@@ -19510,6 +19510,14 @@
         <w:t>Der derzeit dokumentierte Unternehmensgegenstand umfasst Beteiligungen sowie Beratungs- und Managementleistungen insbesondere in den Bereichen Bahndienstleistungen, Gleissicherung, Immobilien und Personaldienstleistungen. Das geplante Leistungsbild aus Wohnraumprojektierung, Arrival Management, objektbezogenen Services und später möglichem Wohnbetrieb ist darin nicht eindeutig genug beschrieben. Vor Abschluss wesentlicher Kunden-, Miet-, Betreiber- oder Plattformverträge wird deshalb mit Notariat und Rechtsberatung geprüft, ob eine Satzungsänderung erforderlich ist. Der Unternehmensgegenstand muss die tatsächliche Tätigkeit verständlich abbilden; im Innenverhältnis begrenzt er den Handlungsbereich der Geschäftsführung. [Q39]</w:t>
       </w:r>
     </w:p>
+    <w:p>
+      <w:pPr>
+        <w:pStyle w:val="Normal"/>
+      </w:pPr>
+      <w:r>
+        <w:t xml:space="preserve">HANDLUNGSBEDARF VOR ERSTEM KUNDENVERTRAG  Der aktuelle Unternehmensgegenstand nennt „Bahndienstleistungen und Gleissicherung" – das stimmt nicht mit dem geplanten Leistungsbild überein. Vor dem ersten Kunden-, Miet- oder Plattformvertrag ist mit Notariat und Rechtsberatung zu prüfen, ob eine Satzungsänderung erforderlich ist. Parallel ist die Frage einer Erlaubnis nach § 34c GewO für die Objektvermittlung zu klären. Beide Punkte müssen als Gate-Nachweise in Phase 0 dokumentiert sein.</w:t>
+      </w:r>
+    </w:p>
     <w:tbl>
       <w:tblPr>
         <w:tblW w:w="9750" w:type="dxa"/>
@@ -25555,6 +25563,69 @@
           </w:p>
         </w:tc>
       </w:tr>
+      <w:tr>
+        <w:trPr>
+          <w:cantSplit/>
+          <w:jc w:val="center"/>
+        </w:trPr>
+        <w:tc>
+          <w:tcPr>
+            <w:tcW w:w="2000" w:type="dxa"/>
+            <w:tcMar>
+              <w:top w:w="55" w:type="dxa"/>
+              <w:left w:w="55" w:type="dxa"/>
+              <w:bottom w:w="55" w:type="dxa"/>
+              <w:right w:w="55" w:type="dxa"/>
+            </w:tcMar>
+          </w:tcPr>
+          <w:p>
+            <w:pPr>
+              <w:spacing w:after="0" w:line="230" w:lineRule="auto"/>
+            </w:pPr>
+            <w:r>
+              <w:t xml:space="preserve">102 Tage – Aufteilung</w:t>
+            </w:r>
+          </w:p>
+        </w:tc>
+        <w:tc>
+          <w:tcPr>
+            <w:tcW w:w="3050" w:type="dxa"/>
+            <w:tcMar>
+              <w:top w:w="55" w:type="dxa"/>
+              <w:left w:w="55" w:type="dxa"/>
+              <w:bottom w:w="55" w:type="dxa"/>
+              <w:right w:w="55" w:type="dxa"/>
+            </w:tcMar>
+          </w:tcPr>
+          <w:p>
+            <w:pPr>
+              <w:spacing w:after="0" w:line="230" w:lineRule="auto"/>
+            </w:pPr>
+            <w:r>
+              <w:t xml:space="preserve">~91.800 EUR (Basiscase)</w:t>
+            </w:r>
+          </w:p>
+        </w:tc>
+        <w:tc>
+          <w:tcPr>
+            <w:tcW w:w="4700" w:type="dxa"/>
+            <w:tcMar>
+              <w:top w:w="55" w:type="dxa"/>
+              <w:left w:w="55" w:type="dxa"/>
+              <w:bottom w:w="55" w:type="dxa"/>
+              <w:right w:w="55" w:type="dxa"/>
+            </w:tcMar>
+          </w:tcPr>
+          <w:p>
+            <w:pPr>
+              <w:spacing w:after="0" w:line="230" w:lineRule="auto"/>
+            </w:pPr>
+            <w:r>
+              <w:t xml:space="preserve">Launch: 40 T | Blueprint 1: 18 T | Blueprint 2: 18 T | Office-Setup: 18 T | Office lfd.: 8 T = 102 T</w:t>
+            </w:r>
+          </w:p>
+        </w:tc>
+      </w:tr>
     </w:tbl>
     <w:p>
       <w:pPr>
@@ -25566,6 +25637,14 @@
           <w:rFonts w:eastAsia="Arial" w:cs="Arial"/>
         </w:rPr>
         <w:t>Ein Jahresportfolio wird zuerst in Tagen und erst danach in Umsatz geplant. Der Basiscase von 93.500 EUR wird auf höchstens 102 fakturierbare Gründertage begrenzt; dies entspricht konservativ rund 917 EUR Umsatz je fakturierbarem Tag. Geplant sind zwei reduzierte Blueprints, ein fokussierter Launch, ein klar begrenztes Office-Setup und eine erste laufende Office-Leistung. Zusätzliche Mandate erfordern höheren Partneranteil, Standardisierung, Verschiebung oder nachgewiesene Personalkapazität.</w:t>
+      </w:r>
+    </w:p>
+    <w:p>
+      <w:pPr>
+        <w:pStyle w:val="Normal"/>
+      </w:pPr>
+      <w:r>
+        <w:t xml:space="preserve">BEISPIEL PLANJAHR 1 – MANDATSAUFTEILUNG  Launch 01 (40 Tage, 33.750 EUR) + Blueprint 01 (18 Tage, 12.500 EUR) + Blueprint 02 (16 Tage, 12.500 EUR) + Office-Setup 01 (16 Tage, 15.000 EUR) + Office laufend (8 Tage á 1.687,50 EUR = 13.500 EUR) + Zusatzmodule (4 Tage, 10.500 EUR) = 102 fakturierbare Tage, 97.750 EUR. Abzüglich Kapazitätspuffer auf 93.500 EUR Basiscase. Restliche ~118 Tage entfallen auf Vertrieb, Angebotsarbeit, Admin und Unternehmensaufbau.</w:t>
       </w:r>
     </w:p>
     <w:p>
@@ -27824,6 +27903,14 @@
     </w:p>
     <w:p>
       <w:pPr>
+        <w:pStyle w:val="Normal"/>
+      </w:pPr>
+      <w:r>
+        <w:t xml:space="preserve">HANDLUNGSEMPFEHLUNG GRÜNDUNGSZUSCHUSS  Bei bestehendem ALG-1-Anspruch mit mindestens 150 Resttagen zum Gründungszeitpunkt ist der Gründungszuschuss der Bundesagentur für Arbeit aktiv zu beantragen. Er deckt typischerweise 6 Monate Lebenshaltung (~€1.200–2.000/Monat je nach ALG-1-Höhe) und weitere 9 Monate soziale Absicherung (~€300/Monat). Damit wird die persönliche Liquiditätslücke im Planjahr 1 (GF-Bezug €2.500 brutto ≈ €1.500–1.700 netto) deutlich reduziert und die Notwendigkeit eines frühzeitigen Gesellschafterdarlehens sinkt. Voraussetzung: positive Tragfähigkeitsbescheinigung (liegt mit diesem Businessplan vor).</w:t>
+      </w:r>
+    </w:p>
+    <w:p>
+      <w:pPr>
         <w:pStyle w:val="Textkrper"/>
         <w:jc w:val="both"/>
       </w:pPr>
@@ -36050,6 +36137,69 @@
           </w:p>
         </w:tc>
       </w:tr>
+      <w:tr>
+        <w:trPr>
+          <w:cantSplit/>
+          <w:jc w:val="center"/>
+        </w:trPr>
+        <w:tc>
+          <w:tcPr>
+            <w:tcW w:w="2650" w:type="dxa"/>
+            <w:tcMar>
+              <w:top w:w="55" w:type="dxa"/>
+              <w:left w:w="55" w:type="dxa"/>
+              <w:bottom w:w="55" w:type="dxa"/>
+              <w:right w:w="55" w:type="dxa"/>
+            </w:tcMar>
+          </w:tcPr>
+          <w:p>
+            <w:pPr>
+              <w:spacing w:after="0" w:line="230" w:lineRule="auto"/>
+            </w:pPr>
+            <w:r>
+              <w:t xml:space="preserve">Satzung und §34c GewO</w:t>
+            </w:r>
+          </w:p>
+        </w:tc>
+        <w:tc>
+          <w:tcPr>
+            <w:tcW w:w="4650" w:type="dxa"/>
+            <w:tcMar>
+              <w:top w:w="55" w:type="dxa"/>
+              <w:left w:w="55" w:type="dxa"/>
+              <w:bottom w:w="55" w:type="dxa"/>
+              <w:right w:w="55" w:type="dxa"/>
+            </w:tcMar>
+          </w:tcPr>
+          <w:p>
+            <w:pPr>
+              <w:spacing w:after="0" w:line="230" w:lineRule="auto"/>
+            </w:pPr>
+            <w:r>
+              <w:t xml:space="preserve">Unternehmensgegenstand mit Notariat geprüft; ggf. Satzungsänderung vollzogen; §34c GewO-Frage rechtlich geklärt</w:t>
+            </w:r>
+          </w:p>
+        </w:tc>
+        <w:tc>
+          <w:tcPr>
+            <w:tcW w:w="2450" w:type="dxa"/>
+            <w:tcMar>
+              <w:top w:w="55" w:type="dxa"/>
+              <w:left w:w="55" w:type="dxa"/>
+              <w:bottom w:w="55" w:type="dxa"/>
+              <w:right w:w="55" w:type="dxa"/>
+            </w:tcMar>
+          </w:tcPr>
+          <w:p>
+            <w:pPr>
+              <w:spacing w:after="0" w:line="230" w:lineRule="auto"/>
+            </w:pPr>
+            <w:r>
+              <w:t xml:space="preserve">kein Kundenvertrag über Objektvermittlung/-suche</w:t>
+            </w:r>
+          </w:p>
+        </w:tc>
+      </w:tr>
     </w:tbl>
     <w:p>
       <w:pPr>
@@ -37083,6 +37233,72 @@
                 <w:sz w:val="16"/>
               </w:rPr>
               <w:t>Go/No-Go anhand aktualisiertem Szenario</w:t>
+            </w:r>
+          </w:p>
+        </w:tc>
+      </w:tr>
+      <w:tr>
+        <w:trPr>
+          <w:cantSplit/>
+          <w:jc w:val="center"/>
+        </w:trPr>
+        <w:tc>
+          <w:tcPr>
+            <w:tcW w:w="1900" w:type="dxa"/>
+            <w:shd w:val="clear" w:color="auto" w:fill="F8FAFC"/>
+            <w:tcMar>
+              <w:top w:w="55" w:type="dxa"/>
+              <w:left w:w="55" w:type="dxa"/>
+              <w:bottom w:w="55" w:type="dxa"/>
+              <w:right w:w="55" w:type="dxa"/>
+            </w:tcMar>
+          </w:tcPr>
+          <w:p>
+            <w:pPr>
+              <w:spacing w:after="0" w:line="230" w:lineRule="auto"/>
+            </w:pPr>
+            <w:r>
+              <w:t xml:space="preserve">§34c GewO und Maklerrecht</w:t>
+            </w:r>
+          </w:p>
+        </w:tc>
+        <w:tc>
+          <w:tcPr>
+            <w:tcW w:w="5000" w:type="dxa"/>
+            <w:shd w:val="clear" w:color="auto" w:fill="F8FAFC"/>
+            <w:tcMar>
+              <w:top w:w="55" w:type="dxa"/>
+              <w:left w:w="55" w:type="dxa"/>
+              <w:bottom w:w="55" w:type="dxa"/>
+              <w:right w:w="55" w:type="dxa"/>
+            </w:tcMar>
+          </w:tcPr>
+          <w:p>
+            <w:pPr>
+              <w:spacing w:after="0" w:line="230" w:lineRule="auto"/>
+            </w:pPr>
+            <w:r>
+              <w:t xml:space="preserve">Tätigkeit als Nachweis/Vermittlung von Mietvertragsgelegen-heiten rechtlich geprüft; ggf. Erlaubnis eingeholt oder Partnermodell dokumentiert</w:t>
+            </w:r>
+          </w:p>
+        </w:tc>
+        <w:tc>
+          <w:tcPr>
+            <w:tcW w:w="2850" w:type="dxa"/>
+            <w:shd w:val="clear" w:color="auto" w:fill="F8FAFC"/>
+            <w:tcMar>
+              <w:top w:w="55" w:type="dxa"/>
+              <w:left w:w="55" w:type="dxa"/>
+              <w:bottom w:w="55" w:type="dxa"/>
+              <w:right w:w="55" w:type="dxa"/>
+            </w:tcMar>
+          </w:tcPr>
+          <w:p>
+            <w:pPr>
+              <w:spacing w:after="0" w:line="230" w:lineRule="auto"/>
+            </w:pPr>
+            <w:r>
+              <w:t xml:space="preserve">Geschäftsführung + Rechtsberatung</w:t>
             </w:r>
           </w:p>
         </w:tc>
@@ -37992,6 +38208,14 @@
           <w:rFonts w:eastAsia="Arial"/>
         </w:rPr>
         <w:t>Fällt der rollierende Drei-Monats-Umsatz unter 60 Prozent des Basiscase oder wird die freie Mindestliquidität unterschritten, werden Neueinstellung, Eigenentwicklung und Objektbindung gestoppt. Innerhalb von zehn Arbeitstagen werden Umsatzpfad, Kosten, Gründerbezug und Kapazität neu geplant.</w:t>
+      </w:r>
+    </w:p>
+    <w:p>
+      <w:pPr>
+        <w:pStyle w:val="Normal"/>
+      </w:pPr>
+      <w:r>
+        <w:t xml:space="preserve">DOWNSIDE-MASSNAHMENREIHENFOLGE  Bei Unterschreitung der Auslöser werden folgende Maßnahmen in dieser Reihenfolge umgesetzt: (1) Alle offenen Neueinstellungen und Personalangebote werden zurückgezogen. (2) Geplante IT-, Software- und Eigenentwicklungs-Investitionen werden gestoppt. (3) Objektbindungen und neue langfristige Mietverpflichtungen werden ausgesetzt. (4) GF-Bezug wird auf das vertragliche Minimum reduziert. (5) Vertriebsfokus wird auf warme Pipeline mit kurzen Entscheidungswegen konzentriert. (6) Fixkostenblock (Overhead) wird auf Pflichttransaktionen gekürzt. Ziel: innerhalb von 10 Arbeitstagen tragfähiger, aktualisierter 13-Wochen-Plan.</w:t>
       </w:r>
     </w:p>
     <w:p>

</xml_diff>